<commit_message>
New title and abstract; LaTeX, PDF and Word regenerated
Co-Authored-By: Claude Opus 5.5 <noreply@anthropic.com>
Claude-Session: https://claude.ai/code/session_01GZj9RPpC1jWG2HHfoJpTCG
</commit_message>
<xml_diff>
--- a/docs/isa/word/CMO_LQI_PIDF_ISA.docx
+++ b/docs/isa/word/CMO_LQI_PIDF_ISA.docx
@@ -11,7 +11,7 @@
           <w:b/>
           <w:bCs/>
         </w:rPr>
-        <w:t xml:space="preserve">Formula-first co-design of a 2-DOF PIDF for a wide-range non-ideal Buck converter: LQI weights as the search space, an exact structural realization, and switched-model validation</w:t>
+        <w:t xml:space="preserve">Structural LQI–PIDF equivalence and constrained weight tuning for a wide-range Buck converter</w:t>
       </w:r>
     </w:p>
     <w:p>
@@ -36,121 +36,127 @@
         <w:pStyle w:val="FirstParagraph"/>
       </w:pPr>
       <w:r>
-        <w:t xml:space="preserve">A formula-first co-design is proposed for a non-ideal asynchronous Buck</w:t>
-      </w:r>
-      <w:r>
-        <w:t xml:space="preserve"> </w:t>
-      </w:r>
-      <w:r>
-        <w:t xml:space="preserve">converter fed at 48 V and commanded over 1 V–46 V. The</w:t>
-      </w:r>
-      <w:r>
-        <w:t xml:space="preserve"> </w:t>
-      </w:r>
-      <w:r>
-        <w:t xml:space="preserve">search space is the set of Bryson excursions of a linear–quadratic–integral</w:t>
-      </w:r>
-      <w:r>
-        <w:t xml:space="preserve"> </w:t>
-      </w:r>
-      <w:r>
-        <w:t xml:space="preserve">(LQI) cost; each candidate is solved from the Riccati equation and realized</w:t>
-      </w:r>
-      <w:r>
-        <w:t xml:space="preserve"> </w:t>
-      </w:r>
-      <w:r>
-        <w:t xml:space="preserve">exactly as a two-degree-of-freedom PIDF that measures the output voltage only.</w:t>
-      </w:r>
-      <w:r>
-        <w:t xml:space="preserve"> </w:t>
-      </w:r>
-      <w:r>
-        <w:t xml:space="preserve">We prove that the derivative filter, with its pole on the ESR zero,</w:t>
-      </w:r>
-      <w:r>
-        <w:t xml:space="preserve"> </w:t>
-      </w:r>
-      <w:r>
-        <w:t xml:space="preserve">reconstructs the capacitor voltage along every trajectory, so the PIDF and the full-state LQI coincide under saturation,</w:t>
-      </w:r>
-      <w:r>
-        <w:t xml:space="preserve"> </w:t>
-      </w:r>
-      <w:r>
-        <w:t xml:space="preserve">anti-windup and discontinuous conduction and differ only through an explicit</w:t>
-      </w:r>
-      <w:r>
-        <w:t xml:space="preserve"> </w:t>
-      </w:r>
-      <w:r>
-        <w:t xml:space="preserve">output-current feedback, an output-network mismatch and sampling; a</w:t>
-      </w:r>
-      <w:r>
-        <w:t xml:space="preserve"> </w:t>
-      </w:r>
-      <w:r>
-        <w:t xml:space="preserve">triangle-hold discretization keeps the sampled PIDF within 0.35 V of the</w:t>
-      </w:r>
-      <w:r>
-        <w:t xml:space="preserve"> </w:t>
-      </w:r>
-      <w:r>
-        <w:t xml:space="preserve">sampled LQI on a 45 V step, against 14.54 V with a zero-order hold.</w:t>
-      </w:r>
-      <w:r>
-        <w:t xml:space="preserve"> </w:t>
-      </w:r>
-      <w:r>
-        <w:t xml:space="preserve">Six equal-budget optimizers with Gaussian-process refinement search the weights</w:t>
-      </w:r>
-      <w:r>
-        <w:t xml:space="preserve"> </w:t>
-      </w:r>
-      <w:r>
-        <w:t xml:space="preserve">under 33 inequalities in engineering units, three measured on a switched model</w:t>
-      </w:r>
-      <w:r>
-        <w:t xml:space="preserve"> </w:t>
-      </w:r>
-      <w:r>
-        <w:t xml:space="preserve">because averaged-feasible designs hold coexisting switching limit cycles. Over</w:t>
-      </w:r>
-      <w:r>
-        <w:t xml:space="preserve"> </w:t>
-      </w:r>
-      <w:r>
-        <w:t xml:space="preserve">30 matched seeds all optimizers reach the same optimum, 18.5 % below</w:t>
-      </w:r>
-      <w:r>
-        <w:t xml:space="preserve"> </w:t>
-      </w:r>
-      <w:r>
-        <w:t xml:space="preserve">the Bryson design. A direct gain-space search reaches the same LQ-optimal controller, but</w:t>
-      </w:r>
-      <w:r>
-        <w:t xml:space="preserve"> </w:t>
-      </w:r>
-      <w:r>
-        <w:t xml:space="preserve">42 % of its feasible designs are not LQ-optimal. On a switched replica of the reference Simulink model, the retained</w:t>
-      </w:r>
-      <w:r>
-        <w:t xml:space="preserve"> </w:t>
-      </w:r>
-      <w:r>
-        <w:t xml:space="preserve">controller removes the overshoot of classical designs and stays within the</w:t>
-      </w:r>
-      <w:r>
-        <w:t xml:space="preserve"> </w:t>
-      </w:r>
-      <w:r>
-        <w:t xml:space="preserve">device current rating; its only miss is 25.6 mV of steady error at</w:t>
-      </w:r>
-      <w:r>
-        <w:t xml:space="preserve"> </w:t>
-      </w:r>
-      <w:r>
-        <w:t xml:space="preserve">1 V against 25 mV, which its full-state twin meets; standard PI, PID, PIDF, LQR, LQG and LQI designs exceed the specification by factors of 6 to 30.</w:t>
+        <w:t xml:space="preserve">Metaheuristic tuning of PID-type controllers for power converters usually</w:t>
+      </w:r>
+      <w:r>
+        <w:t xml:space="preserve"> </w:t>
+      </w:r>
+      <w:r>
+        <w:t xml:space="preserve">searches gain spaces that carry no stability guarantee, and its results are</w:t>
+      </w:r>
+      <w:r>
+        <w:t xml:space="preserve"> </w:t>
+      </w:r>
+      <w:r>
+        <w:t xml:space="preserve">rarely checked against switching effects. This paper shows that, for a</w:t>
+      </w:r>
+      <w:r>
+        <w:t xml:space="preserve"> </w:t>
+      </w:r>
+      <w:r>
+        <w:t xml:space="preserve">non-ideal Buck converter, the linear–quadratic–integral (LQI) law has an</w:t>
+      </w:r>
+      <w:r>
+        <w:t xml:space="preserve"> </w:t>
+      </w:r>
+      <w:r>
+        <w:t xml:space="preserve">exact realization as a two-degree-of-freedom PIDF that measures only the output</w:t>
+      </w:r>
+      <w:r>
+        <w:t xml:space="preserve"> </w:t>
+      </w:r>
+      <w:r>
+        <w:t xml:space="preserve">voltage. When its derivative pole is placed on the capacitor ESR zero, the</w:t>
+      </w:r>
+      <w:r>
+        <w:t xml:space="preserve"> </w:t>
+      </w:r>
+      <w:r>
+        <w:t xml:space="preserve">filter state reconstructs the capacitor voltage along every trajectory. The</w:t>
+      </w:r>
+      <w:r>
+        <w:t xml:space="preserve"> </w:t>
+      </w:r>
+      <w:r>
+        <w:t xml:space="preserve">PIDF and the full-state LQI therefore coincide under saturation, anti-windup</w:t>
+      </w:r>
+      <w:r>
+        <w:t xml:space="preserve"> </w:t>
+      </w:r>
+      <w:r>
+        <w:t xml:space="preserve">and discontinuous conduction. They differ only through an explicit</w:t>
+      </w:r>
+      <w:r>
+        <w:t xml:space="preserve"> </w:t>
+      </w:r>
+      <w:r>
+        <w:t xml:space="preserve">output-current term, output-network mismatch and sampling, and a first-order-hold</w:t>
+      </w:r>
+      <w:r>
+        <w:t xml:space="preserve"> </w:t>
+      </w:r>
+      <w:r>
+        <w:t xml:space="preserve">discretization reduces the sampling gap by a factor of about 40. The controller</w:t>
+      </w:r>
+      <w:r>
+        <w:t xml:space="preserve"> </w:t>
+      </w:r>
+      <w:r>
+        <w:t xml:space="preserve">is tuned by searching the LQI weights, not the gains, so every candidate is</w:t>
+      </w:r>
+      <w:r>
+        <w:t xml:space="preserve"> </w:t>
+      </w:r>
+      <w:r>
+        <w:t xml:space="preserve">LQ-optimal and carries guaranteed margins and a certified pole region. A</w:t>
+      </w:r>
+      <w:r>
+        <w:t xml:space="preserve"> </w:t>
+      </w:r>
+      <w:r>
+        <w:t xml:space="preserve">constrained, multi-fidelity search includes short switched-model simulations to</w:t>
+      </w:r>
+      <w:r>
+        <w:t xml:space="preserve"> </w:t>
+      </w:r>
+      <w:r>
+        <w:t xml:space="preserve">reject coexisting switching limit cycles that averaged models miss. On a</w:t>
+      </w:r>
+      <w:r>
+        <w:t xml:space="preserve"> </w:t>
+      </w:r>
+      <w:r>
+        <w:t xml:space="preserve">48 V converter commanded from 1 to 46 V, six metaheuristics converge</w:t>
+      </w:r>
+      <w:r>
+        <w:t xml:space="preserve"> </w:t>
+      </w:r>
+      <w:r>
+        <w:t xml:space="preserve">to the same optimum. An unconstrained gain search reaches the same controller,</w:t>
+      </w:r>
+      <w:r>
+        <w:t xml:space="preserve"> </w:t>
+      </w:r>
+      <w:r>
+        <w:t xml:space="preserve">but 42 % of its feasible solutions are not LQ-optimal. On a switched</w:t>
+      </w:r>
+      <w:r>
+        <w:t xml:space="preserve"> </w:t>
+      </w:r>
+      <w:r>
+        <w:t xml:space="preserve">replica of the reference Simulink model, the tuned controller eliminates</w:t>
+      </w:r>
+      <w:r>
+        <w:t xml:space="preserve"> </w:t>
+      </w:r>
+      <w:r>
+        <w:t xml:space="preserve">overshoot and respects the device current rating, whereas standard PI, PID,</w:t>
+      </w:r>
+      <w:r>
+        <w:t xml:space="preserve"> </w:t>
+      </w:r>
+      <w:r>
+        <w:t xml:space="preserve">PIDF, LQR, LQG and LQI designs exceed the specification by factors of 6 to 30.</w:t>
       </w:r>
     </w:p>
     <w:p>

</xml_diff>